<commit_message>
Rebrand header logo to match nacew.com and refine contract generation
- Header logo now uses nacew.com's actual gradient wordmark treatment
  (5-color spectrum text-clip) with the caption placed beside it,
  matching the real site markup/CSS instead of a plain text placeholder
- Tighten generated job-duties prompt (max 5 duties, single short
  sentences, no compound bullets) and fix a stray BOM in claudeApi.js
- Update contract/NDA/service-contract docx shell templates
</commit_message>
<xml_diff>
--- a/public/contract-shell.docx
+++ b/public/contract-shell.docx
@@ -15,6 +15,12 @@
       <w:pPr>
         <w:spacing w:line="240" w:lineRule="auto"/>
         <w:jc w:val="center"/>
+      </w:pPr>
+    </w:p>
+    <w:p>
+      <w:pPr>
+        <w:spacing w:line="240" w:lineRule="auto"/>
+        <w:jc w:val="center"/>
         <w:rPr>
           <w:b/>
           <w:bCs/>
@@ -31,6 +37,12 @@
     <w:p>
       <w:pPr>
         <w:spacing w:line="240" w:lineRule="auto"/>
+        <w:jc w:val="center"/>
+      </w:pPr>
+    </w:p>
+    <w:p>
+      <w:pPr>
+        <w:spacing w:line="240" w:lineRule="auto"/>
         <w:jc w:val="both"/>
       </w:pPr>
       <w:r>
@@ -51,7 +63,7 @@
         <w:t>EWWWOLUTION L.L.C</w:t>
       </w:r>
       <w:r>
-        <w:t xml:space="preserve">., me emër tregtar: NACEW inc, me NUI: 811360081, me adresë: Mërgimtrarët e Gjilanit, Hyrja 59, përfaqësuar nga Çlirim Vokshi - Drejtor menaxhues dhe Albert Salihu – Drejtor, në njërën anë  </w:t>
+        <w:t>., me emër tregtar: NACEW inc, me NUI: 811360081, me adresë: Mërgimtrarët e Gjilanit, Hyrja 59, përfaqësuar nga Çlirim Vokshi - Drejtor menaxhues dhe Albert Salihu – Drejtor, në njërën anë</w:t>
       </w:r>
     </w:p>
     <w:p>
@@ -88,6 +100,12 @@
       <w:r>
         <w:t>, i lindur më {{birth_date}}, me vendbanim në {{municipality}}, Adresa: {{street_address}} identifikuar përmes letërnjoftimit me numër personal: {{personal_id}}, në anën tjetër.</w:t>
       </w:r>
+    </w:p>
+    <w:p>
+      <w:pPr>
+        <w:spacing w:line="240" w:lineRule="auto"/>
+        <w:jc w:val="center"/>
+      </w:pPr>
     </w:p>
     <w:p>
       <w:pPr>
@@ -117,11 +135,23 @@
     <w:p>
       <w:pPr>
         <w:spacing w:line="240" w:lineRule="auto"/>
+        <w:jc w:val="center"/>
+      </w:pPr>
+    </w:p>
+    <w:p>
+      <w:pPr>
+        <w:spacing w:line="240" w:lineRule="auto"/>
         <w:jc w:val="both"/>
       </w:pPr>
       <w:r>
         <w:t>Lëndë e kësaj kontrate është rregullimi i marrëdhënies së punës për punëmarrësin përcaktimi i të drejtave dhe detyrimeve të tij, që rrjedhin nga marrëdhënia e punës, si dhe çështjet tjera të cilat derivojnë nga ligji i punës dhe legjislacioni tjetër në fuqi në Republinë e Kosovës.</w:t>
       </w:r>
+    </w:p>
+    <w:p>
+      <w:pPr>
+        <w:spacing w:line="240" w:lineRule="auto"/>
+        <w:jc w:val="center"/>
+      </w:pPr>
     </w:p>
     <w:p>
       <w:pPr>
@@ -151,11 +181,23 @@
     <w:p>
       <w:pPr>
         <w:spacing w:line="240" w:lineRule="auto"/>
+        <w:jc w:val="center"/>
+      </w:pPr>
+    </w:p>
+    <w:p>
+      <w:pPr>
+        <w:spacing w:line="240" w:lineRule="auto"/>
         <w:jc w:val="both"/>
       </w:pPr>
       <w:r>
         <w:t>Punëmarrësi përmes kësaj kontrate lidhë marrëdhënie pune me punëdhënësin për pozitën e punës “{{position}}".</w:t>
       </w:r>
+    </w:p>
+    <w:p>
+      <w:pPr>
+        <w:spacing w:line="240" w:lineRule="auto"/>
+        <w:jc w:val="center"/>
+      </w:pPr>
     </w:p>
     <w:p>
       <w:pPr>
@@ -181,6 +223,12 @@
         <w:br/>
         <w:t>Përshkrimi i detyrave të punës</w:t>
       </w:r>
+    </w:p>
+    <w:p>
+      <w:pPr>
+        <w:spacing w:line="240" w:lineRule="auto"/>
+        <w:jc w:val="center"/>
+      </w:pPr>
     </w:p>
     <w:p>
       <w:pPr>
@@ -261,8 +309,14 @@
         <w:jc w:val="both"/>
       </w:pPr>
       <w:r>
-        <w:t xml:space="preserve">3.2. Detyrat e punës punëmmarësi duhet t’i kryej me integritet të lartë personal, duke bashkëpunuar me stafin tjetër të punës, si dhe duke i respektuar hierarkinë dhe aktet e brendshme të punëdhënësit. </w:t>
-      </w:r>
+        <w:t>3.2. Detyrat e punës punëmmarësi duhet t’i kryej me integritet të lartë personal, duke bashkëpunuar me stafin tjetër të punës, si dhe duke i respektuar hierarkinë dhe aktet e brendshme të punëdhënësit.</w:t>
+      </w:r>
+    </w:p>
+    <w:p>
+      <w:pPr>
+        <w:spacing w:line="240" w:lineRule="auto"/>
+        <w:jc w:val="center"/>
+      </w:pPr>
     </w:p>
     <w:p>
       <w:pPr>
@@ -300,25 +354,28 @@
     </w:p>
     <w:p>
       <w:pPr>
-        <w:spacing w:after="0" w:line="240" w:lineRule="auto"/>
-        <w:jc w:val="center"/>
-        <w:rPr>
-          <w:sz w:val="12"/>
-          <w:szCs w:val="12"/>
-        </w:rPr>
-      </w:pPr>
-    </w:p>
-    <w:p>
-      <w:pPr>
-        <w:spacing w:line="240" w:lineRule="auto"/>
-        <w:jc w:val="both"/>
-      </w:pPr>
-      <w:r>
+        <w:spacing w:line="240" w:lineRule="auto"/>
+        <w:jc w:val="center"/>
+      </w:pPr>
+    </w:p>
+    <w:p>
+      <w:pPr>
+        <w:spacing w:line="240" w:lineRule="auto"/>
+        <w:jc w:val="both"/>
+      </w:pPr>
+      <w:r>
+        <w:lastRenderedPageBreak/>
         <w:t>I punësuar do të punoj në selinë e punëdhënësit në Gjilan, në adresën: Mërgimtarët e Gjilanit, Nr.59, ose nga distanca, sipas dakordimit me punëdhënësin.</w:t>
       </w:r>
     </w:p>
     <w:p>
       <w:pPr>
+        <w:spacing w:line="240" w:lineRule="auto"/>
+        <w:jc w:val="center"/>
+      </w:pPr>
+    </w:p>
+    <w:p>
+      <w:pPr>
         <w:spacing w:after="0" w:line="240" w:lineRule="auto"/>
         <w:jc w:val="center"/>
         <w:rPr>
@@ -364,27 +421,32 @@
         <w:jc w:val="both"/>
       </w:pPr>
       <w:r>
-        <w:t xml:space="preserve">5.1. Kjo kontratë lidhet me orar të plotë. Orari i plotë i punësgjatë ditës është 8 orë, kurse gjatë javës gjithsej 40 (dyzet) orë në javë. </w:t>
-      </w:r>
-    </w:p>
-    <w:p>
-      <w:pPr>
-        <w:spacing w:line="240" w:lineRule="auto"/>
-        <w:jc w:val="both"/>
-      </w:pPr>
-      <w:r>
-        <w:t xml:space="preserve">5.2.Orari i punës për punëmarrësin është nga ora 9:00 deri në orën 17:00 nga e hëna deri të premten, por në raste të caktuara me kërkesë të punëdhënësit mund të jetë edhe fleksibil. </w:t>
-      </w:r>
-    </w:p>
-    <w:p>
-      <w:pPr>
-        <w:spacing w:line="240" w:lineRule="auto"/>
-        <w:jc w:val="both"/>
-      </w:pPr>
-      <w:r>
-        <w:lastRenderedPageBreak/>
+        <w:t>5.1. Kjo kontratë lidhet me orar të plotë. Orari i plotë i punësgjatë ditës është 8 orë, kurse gjatë javës gjithsej 40 (dyzet) orë në javë.</w:t>
+      </w:r>
+    </w:p>
+    <w:p>
+      <w:pPr>
+        <w:spacing w:line="240" w:lineRule="auto"/>
+        <w:jc w:val="both"/>
+      </w:pPr>
+      <w:r>
+        <w:t>5.2.Orari i punës për punëmarrësin është nga ora 9:00 deri në orën 17:00 nga e hëna deri të premten, por në raste të caktuara me kërkesë të punëdhënësit mund të jetë edhe fleksibil.</w:t>
+      </w:r>
+    </w:p>
+    <w:p>
+      <w:pPr>
+        <w:spacing w:line="240" w:lineRule="auto"/>
+        <w:jc w:val="both"/>
+      </w:pPr>
+      <w:r>
         <w:t>5.3. Punëmarrësi ka të drejtë në pushim gjatë ditës në kohëzgjatje prej gjysëm ore.</w:t>
       </w:r>
+    </w:p>
+    <w:p>
+      <w:pPr>
+        <w:spacing w:line="240" w:lineRule="auto"/>
+        <w:jc w:val="center"/>
+      </w:pPr>
     </w:p>
     <w:p>
       <w:pPr>
@@ -462,6 +524,12 @@
     </w:p>
     <w:p>
       <w:pPr>
+        <w:spacing w:line="240" w:lineRule="auto"/>
+        <w:jc w:val="center"/>
+      </w:pPr>
+    </w:p>
+    <w:p>
+      <w:pPr>
         <w:spacing w:after="0" w:line="240" w:lineRule="auto"/>
         <w:jc w:val="center"/>
         <w:rPr>
@@ -496,14 +564,8 @@
     </w:p>
     <w:p>
       <w:pPr>
-        <w:spacing w:after="0" w:line="240" w:lineRule="auto"/>
-        <w:jc w:val="center"/>
-        <w:rPr>
-          <w:b/>
-          <w:bCs/>
-          <w:sz w:val="12"/>
-          <w:szCs w:val="12"/>
-        </w:rPr>
+        <w:spacing w:line="240" w:lineRule="auto"/>
+        <w:jc w:val="center"/>
       </w:pPr>
     </w:p>
     <w:p>
@@ -526,6 +588,12 @@
     </w:p>
     <w:p>
       <w:pPr>
+        <w:spacing w:line="240" w:lineRule="auto"/>
+        <w:jc w:val="center"/>
+      </w:pPr>
+    </w:p>
+    <w:p>
+      <w:pPr>
         <w:spacing w:after="0" w:line="240" w:lineRule="auto"/>
         <w:jc w:val="center"/>
         <w:rPr>
@@ -560,12 +628,8 @@
     </w:p>
     <w:p>
       <w:pPr>
-        <w:spacing w:after="0" w:line="240" w:lineRule="auto"/>
-        <w:jc w:val="center"/>
-        <w:rPr>
-          <w:sz w:val="12"/>
-          <w:szCs w:val="12"/>
-        </w:rPr>
+        <w:spacing w:line="240" w:lineRule="auto"/>
+        <w:jc w:val="center"/>
       </w:pPr>
     </w:p>
     <w:p>
@@ -578,7 +642,7 @@
         <w:jc w:val="both"/>
       </w:pPr>
       <w:r>
-        <w:t xml:space="preserve">8.1. Punëmarrësi  për punën e kryer do të shpërblehet në pagë mujore Bruto, në shumën prej {{salary_amount}} ({{salary_words}}). </w:t>
+        <w:t>8.1. Punëmarrësi  për punën e kryer do të shpërblehet në pagë mujore Bruto, në shumën prej {{salary_amount}} ({{salary_words}}).</w:t>
       </w:r>
     </w:p>
     <w:p>
@@ -594,6 +658,12 @@
       <w:pPr>
         <w:spacing w:line="240" w:lineRule="auto"/>
         <w:jc w:val="center"/>
+      </w:pPr>
+    </w:p>
+    <w:p>
+      <w:pPr>
+        <w:spacing w:line="240" w:lineRule="auto"/>
+        <w:jc w:val="center"/>
         <w:rPr>
           <w:b/>
           <w:bCs/>
@@ -605,13 +675,6 @@
           <w:bCs/>
         </w:rPr>
         <w:t>Nëni 9</w:t>
-      </w:r>
-      <w:r>
-        <w:rPr>
-          <w:b/>
-          <w:bCs/>
-        </w:rPr>
-        <w:tab/>
       </w:r>
       <w:r>
         <w:rPr>
@@ -625,9 +688,16 @@
     <w:p>
       <w:pPr>
         <w:spacing w:line="240" w:lineRule="auto"/>
-        <w:jc w:val="both"/>
-      </w:pPr>
-      <w:r>
+        <w:jc w:val="center"/>
+      </w:pPr>
+    </w:p>
+    <w:p>
+      <w:pPr>
+        <w:spacing w:line="240" w:lineRule="auto"/>
+        <w:jc w:val="both"/>
+      </w:pPr>
+      <w:r>
+        <w:lastRenderedPageBreak/>
         <w:t>9.1. Punëmarrësi ka të drejtë në pushim vjetor me pagesë, në kohëzgjatje prej 4 jave pune brenda një viti kalendarik, për të cilën duhet të koordinohet paraprakisht me punëdhënësin, dhe të paraqesë kërkesë me shkrim 15 ditë më herët.</w:t>
       </w:r>
     </w:p>
@@ -682,21 +752,13 @@
         <w:jc w:val="both"/>
       </w:pPr>
       <w:r>
-        <w:t xml:space="preserve">9.7. Punëmarrësi pushimin vjetor mund ta shfrytëzoj në dy apo më shumë pjesë, por pjesa kryesore e pushimit nuk mund të shfrytëzohet më pak sesa 10 (dhjetë) ditë pune </w:t>
-      </w:r>
-      <w:r>
-        <w:lastRenderedPageBreak/>
-        <w:t>pandërprerë. Ndërsa pjesa tjetër e pushimit shfrytëzohet jo më vonë se data 30 Dhjetorit të atij viti kalendarik.</w:t>
-      </w:r>
-    </w:p>
-    <w:p>
-      <w:pPr>
-        <w:spacing w:line="240" w:lineRule="auto"/>
-        <w:jc w:val="both"/>
-        <w:rPr>
-          <w:sz w:val="12"/>
-          <w:szCs w:val="12"/>
-        </w:rPr>
+        <w:t>9.7. Punëmarrësi pushimin vjetor mund ta shfrytëzoj në dy apo më shumë pjesë, por pjesa kryesore e pushimit nuk mund të shfrytëzohet më pak sesa 10 (dhjetë) ditë pune pandërprerë. Ndërsa pjesa tjetër e pushimit shfrytëzohet jo më vonë se data 30 Dhjetorit të atij viti kalendarik.</w:t>
+      </w:r>
+    </w:p>
+    <w:p>
+      <w:pPr>
+        <w:spacing w:line="240" w:lineRule="auto"/>
+        <w:jc w:val="center"/>
       </w:pPr>
     </w:p>
     <w:p>
@@ -735,14 +797,8 @@
     </w:p>
     <w:p>
       <w:pPr>
-        <w:spacing w:after="0" w:line="240" w:lineRule="auto"/>
-        <w:jc w:val="both"/>
-        <w:rPr>
-          <w:b/>
-          <w:bCs/>
-          <w:sz w:val="12"/>
-          <w:szCs w:val="12"/>
-        </w:rPr>
+        <w:spacing w:line="240" w:lineRule="auto"/>
+        <w:jc w:val="center"/>
       </w:pPr>
     </w:p>
     <w:p>
@@ -756,6 +812,12 @@
     </w:p>
     <w:p>
       <w:pPr>
+        <w:spacing w:line="240" w:lineRule="auto"/>
+        <w:jc w:val="center"/>
+      </w:pPr>
+    </w:p>
+    <w:p>
+      <w:pPr>
         <w:spacing w:after="0" w:line="240" w:lineRule="auto"/>
         <w:jc w:val="center"/>
         <w:rPr>
@@ -790,12 +852,8 @@
     </w:p>
     <w:p>
       <w:pPr>
-        <w:spacing w:after="0" w:line="240" w:lineRule="auto"/>
-        <w:jc w:val="both"/>
-        <w:rPr>
-          <w:sz w:val="12"/>
-          <w:szCs w:val="12"/>
-        </w:rPr>
+        <w:spacing w:line="240" w:lineRule="auto"/>
+        <w:jc w:val="center"/>
       </w:pPr>
     </w:p>
     <w:p>
@@ -806,16 +864,6 @@
       <w:r>
         <w:t>I punësuari ka të drejtë të mungoj nga puna me kompensim të pagës në rastet vijuese:</w:t>
       </w:r>
-    </w:p>
-    <w:p>
-      <w:pPr>
-        <w:spacing w:after="0" w:line="240" w:lineRule="auto"/>
-        <w:jc w:val="both"/>
-        <w:rPr>
-          <w:sz w:val="12"/>
-          <w:szCs w:val="12"/>
-        </w:rPr>
-      </w:pPr>
     </w:p>
     <w:p>
       <w:pPr>
@@ -949,12 +997,8 @@
     </w:p>
     <w:p>
       <w:pPr>
-        <w:spacing w:after="0" w:line="240" w:lineRule="auto"/>
-        <w:jc w:val="both"/>
-        <w:rPr>
-          <w:sz w:val="12"/>
-          <w:szCs w:val="12"/>
-        </w:rPr>
+        <w:spacing w:line="240" w:lineRule="auto"/>
+        <w:jc w:val="center"/>
       </w:pPr>
     </w:p>
     <w:p>
@@ -993,21 +1037,21 @@
     </w:p>
     <w:p>
       <w:pPr>
-        <w:spacing w:after="0" w:line="240" w:lineRule="auto"/>
-        <w:jc w:val="both"/>
-        <w:rPr>
-          <w:sz w:val="12"/>
-          <w:szCs w:val="12"/>
-        </w:rPr>
-      </w:pPr>
-    </w:p>
-    <w:p>
-      <w:pPr>
-        <w:spacing w:after="0" w:line="240" w:lineRule="auto"/>
-        <w:jc w:val="both"/>
-      </w:pPr>
-      <w:r>
-        <w:t>I punësuar me leje të pundëdhënësit mund të mungoj nga puna pa kompensim të pagës, dhe me atë rast të punësuari i pushojnë të drejtat dhe detyrimet nga marrëdhënia e punës, përveç të drejtave që burojnë për pagesën e detyrueshme të kontributeve nga ana e të punësuarit.</w:t>
+        <w:spacing w:line="240" w:lineRule="auto"/>
+        <w:jc w:val="center"/>
+      </w:pPr>
+    </w:p>
+    <w:p>
+      <w:pPr>
+        <w:spacing w:after="0" w:line="240" w:lineRule="auto"/>
+        <w:jc w:val="both"/>
+      </w:pPr>
+      <w:r>
+        <w:t xml:space="preserve">I punësuar me leje të pundëdhënësit mund të mungoj nga puna pa kompensim të pagës, dhe me atë rast të punësuari i pushojnë të drejtat dhe detyrimet nga marrëdhënia e punës, </w:t>
+      </w:r>
+      <w:r>
+        <w:lastRenderedPageBreak/>
+        <w:t>përveç të drejtave që burojnë për pagesën e detyrueshme të kontributeve nga ana e të punësuarit.</w:t>
       </w:r>
     </w:p>
     <w:p>
@@ -1032,13 +1076,6 @@
           <w:b/>
           <w:bCs/>
         </w:rPr>
-        <w:tab/>
-      </w:r>
-      <w:r>
-        <w:rPr>
-          <w:b/>
-          <w:bCs/>
-        </w:rPr>
         <w:br/>
         <w:t>Paga shtesë dhe kompensimi i pagës</w:t>
       </w:r>
@@ -1046,6 +1083,12 @@
     <w:p>
       <w:pPr>
         <w:spacing w:line="240" w:lineRule="auto"/>
+        <w:jc w:val="center"/>
+      </w:pPr>
+    </w:p>
+    <w:p>
+      <w:pPr>
+        <w:spacing w:line="240" w:lineRule="auto"/>
         <w:jc w:val="both"/>
       </w:pPr>
       <w:r>
@@ -1054,6 +1097,12 @@
     </w:p>
     <w:p>
       <w:pPr>
+        <w:spacing w:line="240" w:lineRule="auto"/>
+        <w:jc w:val="center"/>
+      </w:pPr>
+    </w:p>
+    <w:p>
+      <w:pPr>
         <w:spacing w:after="0" w:line="240" w:lineRule="auto"/>
         <w:jc w:val="center"/>
         <w:rPr>
@@ -1110,6 +1159,12 @@
       <w:r>
         <w:t>14.2. Rastet tjera të pushimit mjekësor dhe modalitetet rreth këtij pushimi rregullohen me nenin 59 të Ligjit të Punës në fuqi.</w:t>
       </w:r>
+    </w:p>
+    <w:p>
+      <w:pPr>
+        <w:spacing w:line="240" w:lineRule="auto"/>
+        <w:jc w:val="center"/>
+      </w:pPr>
     </w:p>
     <w:p>
       <w:pPr>
@@ -1151,24 +1206,16 @@
     </w:p>
     <w:p>
       <w:pPr>
+        <w:spacing w:line="240" w:lineRule="auto"/>
+        <w:jc w:val="center"/>
+      </w:pPr>
+    </w:p>
+    <w:p>
+      <w:pPr>
         <w:tabs>
           <w:tab w:val="left" w:pos="-720"/>
           <w:tab w:val="left" w:pos="426"/>
         </w:tabs>
-        <w:spacing w:after="0" w:line="240" w:lineRule="auto"/>
-        <w:jc w:val="both"/>
-        <w:rPr>
-          <w:b/>
-          <w:bCs/>
-        </w:rPr>
-      </w:pPr>
-    </w:p>
-    <w:p>
-      <w:pPr>
-        <w:tabs>
-          <w:tab w:val="left" w:pos="-720"/>
-          <w:tab w:val="left" w:pos="426"/>
-        </w:tabs>
         <w:spacing w:line="240" w:lineRule="auto"/>
         <w:jc w:val="both"/>
       </w:pPr>
@@ -1182,11 +1229,7 @@
         <w:jc w:val="both"/>
       </w:pPr>
       <w:r>
-        <w:t xml:space="preserve"> 2. Punëmarrësi është përgjegjë  edhe për kompensimin e dëmit të shkaktuar ndaj palës së tretë, dëm të cilin punëdhënësi  e ka kompensuar, kur ky dëm është shkaktuar me fajin </w:t>
-      </w:r>
-      <w:r>
-        <w:lastRenderedPageBreak/>
-        <w:t xml:space="preserve">e tij. </w:t>
+        <w:t>2. Punëmarrësi është përgjegjë  edhe për kompensimin e dëmit të shkaktuar ndaj palës së tretë, dëm të cilin punëdhënësi  e ka kompensuar, kur ky dëm është shkaktuar me fajin e tij.</w:t>
       </w:r>
       <w:r>
         <w:tab/>
@@ -1209,14 +1252,7 @@
           <w:b/>
           <w:bCs/>
         </w:rPr>
-        <w:t xml:space="preserve">     Neni 16</w:t>
-      </w:r>
-      <w:r>
-        <w:rPr>
-          <w:b/>
-          <w:bCs/>
-        </w:rPr>
-        <w:tab/>
+        <w:t>Neni 16</w:t>
       </w:r>
       <w:r>
         <w:rPr>
@@ -1239,8 +1275,7 @@
     </w:p>
     <w:p>
       <w:pPr>
-        <w:spacing w:after="0" w:line="240" w:lineRule="auto"/>
-        <w:jc w:val="both"/>
+        <w:spacing w:line="240" w:lineRule="auto"/>
       </w:pPr>
     </w:p>
     <w:p>
@@ -1280,11 +1315,7 @@
     <w:p>
       <w:pPr>
         <w:spacing w:line="240" w:lineRule="auto"/>
-        <w:jc w:val="both"/>
-        <w:rPr>
-          <w:sz w:val="12"/>
-          <w:szCs w:val="12"/>
-        </w:rPr>
+        <w:jc w:val="center"/>
       </w:pPr>
     </w:p>
     <w:p>
@@ -1302,15 +1333,16 @@
         <w:jc w:val="both"/>
       </w:pPr>
       <w:r>
-        <w:t xml:space="preserve">17.2. Punëdhënësi mund ta ndërprejë marrëdhënien e punës në mënyrë të njëanshme me paralajmrim paraprak me shkrim prej 30 (pesëmbëdhjetë) ditëve, apo edhe me afat paraljmërimi më të shkurtër ose pa paralajmërim fare, në rastet e përcaktuara me Ligjin e Punës. </w:t>
-      </w:r>
-    </w:p>
-    <w:p>
-      <w:pPr>
-        <w:spacing w:line="240" w:lineRule="auto"/>
-        <w:jc w:val="both"/>
-      </w:pPr>
-      <w:r>
+        <w:t>17.2. Punëdhënësi mund ta ndërprejë marrëdhënien e punës në mënyrë të njëanshme me paralajmrim paraprak me shkrim prej 30 (pesëmbëdhjetë) ditëve, apo edhe me afat paraljmërimi më të shkurtër ose pa paralajmërim fare, në rastet e përcaktuara me Ligjin e Punës.</w:t>
+      </w:r>
+    </w:p>
+    <w:p>
+      <w:pPr>
+        <w:spacing w:line="240" w:lineRule="auto"/>
+        <w:jc w:val="both"/>
+      </w:pPr>
+      <w:r>
+        <w:lastRenderedPageBreak/>
         <w:t>17.3. Nëse punëdhënësi  nuk ka për qëllim të ripërtërijë këtë kontratë pune me periudhë të caktuar, atëherë duhet të informojë punësuarin së paku tridhjetë (30) ditë para skadimit të kontratës.</w:t>
       </w:r>
     </w:p>
@@ -1325,6 +1357,12 @@
     </w:p>
     <w:p>
       <w:pPr>
+        <w:spacing w:line="240" w:lineRule="auto"/>
+        <w:jc w:val="center"/>
+      </w:pPr>
+    </w:p>
+    <w:p>
+      <w:pPr>
         <w:spacing w:after="0" w:line="240" w:lineRule="auto"/>
         <w:jc w:val="center"/>
         <w:rPr>
@@ -1359,12 +1397,8 @@
     </w:p>
     <w:p>
       <w:pPr>
-        <w:spacing w:after="0" w:line="240" w:lineRule="auto"/>
-        <w:jc w:val="both"/>
-        <w:rPr>
-          <w:sz w:val="12"/>
-          <w:szCs w:val="12"/>
-        </w:rPr>
+        <w:spacing w:line="240" w:lineRule="auto"/>
+        <w:jc w:val="center"/>
       </w:pPr>
     </w:p>
     <w:p>
@@ -1701,31 +1735,10 @@
       <w:pPr>
         <w:spacing w:after="0" w:line="240" w:lineRule="auto"/>
         <w:jc w:val="both"/>
-        <w:rPr>
-          <w:sz w:val="12"/>
-          <w:szCs w:val="12"/>
-        </w:rPr>
-      </w:pPr>
-    </w:p>
-    <w:p>
-      <w:pPr>
-        <w:spacing w:after="0" w:line="240" w:lineRule="auto"/>
-        <w:jc w:val="both"/>
-      </w:pPr>
-      <w:r>
-        <w:lastRenderedPageBreak/>
+      </w:pPr>
+      <w:r>
         <w:t>18.3. Shkelje e rëndë e detyrave të punës konsiderohet:</w:t>
       </w:r>
-    </w:p>
-    <w:p>
-      <w:pPr>
-        <w:spacing w:after="0" w:line="240" w:lineRule="auto"/>
-        <w:jc w:val="both"/>
-        <w:rPr>
-          <w:sz w:val="12"/>
-          <w:szCs w:val="12"/>
-        </w:rPr>
-      </w:pPr>
     </w:p>
     <w:p>
       <w:pPr>
@@ -1906,7 +1919,7 @@
         <w:rPr>
           <w:color w:val="000000"/>
         </w:rPr>
-        <w:t xml:space="preserve"> Zbulimi i konfidencialitetit të informatave të marra gjatë kryerjes së punës</w:t>
+        <w:t>Zbulimi i konfidencialitetit të informatave të marra gjatë kryerjes së punës</w:t>
       </w:r>
     </w:p>
     <w:p>
@@ -1991,16 +2004,6 @@
       <w:pPr>
         <w:spacing w:after="0" w:line="240" w:lineRule="auto"/>
         <w:jc w:val="both"/>
-        <w:rPr>
-          <w:sz w:val="12"/>
-          <w:szCs w:val="12"/>
-        </w:rPr>
-      </w:pPr>
-    </w:p>
-    <w:p>
-      <w:pPr>
-        <w:spacing w:after="0" w:line="240" w:lineRule="auto"/>
-        <w:jc w:val="both"/>
       </w:pPr>
       <w:r>
         <w:t>18.4. Për shkeljet e rënda të punëmarrësi, Drejtori apo Drejtori Menaxhues i Punëdhënësit do të formojë një komision Ad hoc, në përbërje prej 3 anëtarëve të brendshëm të kompanisë, të cilët brenda afatit prej 15 ditëve do të zhvillojnë një procedurë dispilinore dhe do të marrin vendim për shqiptimin e njërës nga këto masa: a) ulje në pozië, b)suspendim të përkohëshëm apo c) ndërprerje të marrëdhënies së punës.</w:t>
@@ -2010,18 +2013,9 @@
       <w:pPr>
         <w:spacing w:after="0" w:line="240" w:lineRule="auto"/>
         <w:jc w:val="both"/>
-        <w:rPr>
-          <w:sz w:val="12"/>
-          <w:szCs w:val="12"/>
-        </w:rPr>
-      </w:pPr>
-    </w:p>
-    <w:p>
-      <w:pPr>
-        <w:spacing w:after="0" w:line="240" w:lineRule="auto"/>
-        <w:jc w:val="both"/>
-      </w:pPr>
-      <w:r>
+      </w:pPr>
+      <w:r>
+        <w:lastRenderedPageBreak/>
         <w:t>18.5. Për shkelje të lehta nga punëmarrësi, Drejtori apo Drejtori Menaxhues i Punëdhënësit i punëdhënësit mund të shqiptojnë vërejtja verbale dhe vrejtja me shkrim, dhe nuk nevojitet zhvillimi i procedurës disiplinore.</w:t>
       </w:r>
     </w:p>
@@ -2029,16 +2023,6 @@
       <w:pPr>
         <w:spacing w:after="0" w:line="240" w:lineRule="auto"/>
         <w:jc w:val="both"/>
-        <w:rPr>
-          <w:sz w:val="12"/>
-          <w:szCs w:val="12"/>
-        </w:rPr>
-      </w:pPr>
-    </w:p>
-    <w:p>
-      <w:pPr>
-        <w:spacing w:after="0" w:line="240" w:lineRule="auto"/>
-        <w:jc w:val="both"/>
       </w:pPr>
       <w:r>
         <w:t>18.6. Përgjegjësia disiplinore nuk e përjashton përgjegjësinë gjyqësore civile dhe penale të punëmarrësit.</w:t>
@@ -2046,12 +2030,8 @@
     </w:p>
     <w:p>
       <w:pPr>
-        <w:spacing w:after="0" w:line="240" w:lineRule="auto"/>
-        <w:jc w:val="both"/>
-        <w:rPr>
-          <w:sz w:val="12"/>
-          <w:szCs w:val="12"/>
-        </w:rPr>
+        <w:spacing w:line="240" w:lineRule="auto"/>
+        <w:jc w:val="center"/>
       </w:pPr>
     </w:p>
     <w:p>
@@ -2107,7 +2087,74 @@
       </w:pPr>
       <w:r>
         <w:br/>
-        <w:t xml:space="preserve">19.1. Në asnjë rast, dispozitat e kësaj kontrate nuk mund të jenë më pak të favorshme për të punësuarin dhe punëdhënësin, sesa dispozitat e Ligjit të Punës për sa u përket të drejtave dhe kushteve nga marrëdhënia juridike e punës. </w:t>
+        <w:t>19.1. Në asnjë rast, dispozitat e kësaj kontrate nuk mund të jenë më pak të favorshme për të punësuarin dhe punëdhënësin, sesa dispozitat e Ligjit të Punës për sa u përket të drejtave dhe kushteve nga marrëdhënia juridike e punës.</w:t>
+      </w:r>
+    </w:p>
+    <w:p>
+      <w:pPr>
+        <w:spacing w:after="0" w:line="240" w:lineRule="auto"/>
+        <w:jc w:val="both"/>
+      </w:pPr>
+      <w:r>
+        <w:t>19.2. Përveç nëse nuk parashihet ndryshe me këtë kontratë, lidhur me të gjitha të drejtat dhe obligimet të cilat nuk parashihen në të, aplikohen dispozitat e Ligjit të Punës dhe Akteve të brendshme të punëdhënësit.</w:t>
+      </w:r>
+    </w:p>
+    <w:p>
+      <w:pPr>
+        <w:spacing w:line="240" w:lineRule="auto"/>
+        <w:jc w:val="center"/>
+      </w:pPr>
+    </w:p>
+    <w:p>
+      <w:pPr>
+        <w:spacing w:after="0" w:line="240" w:lineRule="auto"/>
+        <w:jc w:val="center"/>
+        <w:rPr>
+          <w:b/>
+          <w:bCs/>
+        </w:rPr>
+      </w:pPr>
+      <w:r>
+        <w:rPr>
+          <w:b/>
+          <w:bCs/>
+        </w:rPr>
+        <w:t>Neni 20</w:t>
+      </w:r>
+    </w:p>
+    <w:p>
+      <w:pPr>
+        <w:spacing w:after="0" w:line="240" w:lineRule="auto"/>
+        <w:jc w:val="center"/>
+        <w:rPr>
+          <w:b/>
+          <w:bCs/>
+        </w:rPr>
+      </w:pPr>
+      <w:r>
+        <w:rPr>
+          <w:b/>
+          <w:bCs/>
+        </w:rPr>
+        <w:t>Hyrja në fuqi dhe zgjidhja e kontesteve</w:t>
+      </w:r>
+    </w:p>
+    <w:p>
+      <w:pPr>
+        <w:spacing w:line="240" w:lineRule="auto"/>
+        <w:jc w:val="center"/>
+      </w:pPr>
+    </w:p>
+    <w:p>
+      <w:pPr>
+        <w:spacing w:after="0" w:line="240" w:lineRule="auto"/>
+        <w:jc w:val="both"/>
+      </w:pPr>
+      <w:r>
+        <w:t>20.1. Kjo kotratë hyn në fuqi më datë {{start_date}}.</w:t>
+      </w:r>
+      <w:r>
+        <w:tab/>
       </w:r>
     </w:p>
     <w:p>
@@ -2119,83 +2166,8 @@
         <w:spacing w:after="0" w:line="240" w:lineRule="auto"/>
         <w:jc w:val="both"/>
       </w:pPr>
-    </w:p>
-    <w:p>
-      <w:pPr>
-        <w:spacing w:after="0" w:line="240" w:lineRule="auto"/>
-        <w:jc w:val="both"/>
-      </w:pPr>
-      <w:r>
-        <w:t>19.2. Përveç nëse nuk parashihet ndryshe me këtë kontratë, lidhur me të gjitha të drejtat dhe obligimet të cilat nuk parashihen në të, aplikohen dispozitat e Ligjit të Punës dhe Akteve të brendshme të punëdhënësit.</w:t>
-      </w:r>
-    </w:p>
-    <w:p>
-      <w:pPr>
-        <w:spacing w:after="0" w:line="240" w:lineRule="auto"/>
-        <w:jc w:val="both"/>
-        <w:rPr>
-          <w:sz w:val="12"/>
-          <w:szCs w:val="12"/>
-        </w:rPr>
-      </w:pPr>
-    </w:p>
-    <w:p>
-      <w:pPr>
-        <w:spacing w:after="0" w:line="240" w:lineRule="auto"/>
-        <w:jc w:val="center"/>
-        <w:rPr>
-          <w:b/>
-          <w:bCs/>
-        </w:rPr>
-      </w:pPr>
-      <w:r>
-        <w:rPr>
-          <w:b/>
-          <w:bCs/>
-        </w:rPr>
-        <w:t>Neni 20</w:t>
-      </w:r>
-    </w:p>
-    <w:p>
-      <w:pPr>
-        <w:spacing w:after="0" w:line="240" w:lineRule="auto"/>
-        <w:jc w:val="center"/>
-        <w:rPr>
-          <w:b/>
-          <w:bCs/>
-        </w:rPr>
-      </w:pPr>
-      <w:r>
-        <w:rPr>
-          <w:b/>
-          <w:bCs/>
-        </w:rPr>
-        <w:t>Hyrja në fuqi dhe zgjidhja e kontesteve</w:t>
-      </w:r>
-    </w:p>
-    <w:p>
-      <w:pPr>
-        <w:spacing w:after="0" w:line="240" w:lineRule="auto"/>
-        <w:jc w:val="both"/>
-        <w:rPr>
-          <w:sz w:val="12"/>
-          <w:szCs w:val="12"/>
-        </w:rPr>
-      </w:pPr>
-    </w:p>
-    <w:p>
-      <w:pPr>
-        <w:spacing w:after="0" w:line="240" w:lineRule="auto"/>
-        <w:jc w:val="both"/>
-      </w:pPr>
-      <w:r>
-        <w:t xml:space="preserve">20.1. Kjo kotratë hyn në fuqi më datë {{start_date}}. </w:t>
-      </w:r>
-      <w:r>
-        <w:tab/>
-      </w:r>
-      <w:r>
-        <w:br/>
+      <w:r>
+        <w:t>20.2. Në rast kontesti eventual mes palëve kontraktuese, kompetente për zgjidhjen e kontesti është Gjykata Themelore në Gjilan.</w:t>
       </w:r>
     </w:p>
     <w:p>
@@ -2208,7 +2180,7 @@
         <w:jc w:val="both"/>
       </w:pPr>
       <w:r>
-        <w:t>20.2. Në rast kontesti eventual mes palëve kontraktuese, kompetente për zgjidhjen e kontesti është Gjykata Themelore në Gjilan.</w:t>
+        <w:t>20.3. Kjo kontratë është e përpiluar vetëm në gjuhën shqipe, dhe secila palë do të posedojë nga 1 (një) kopje identike të kësaj kontrate.</w:t>
       </w:r>
     </w:p>
     <w:p>
@@ -2220,6 +2192,9 @@
         <w:spacing w:after="0" w:line="240" w:lineRule="auto"/>
         <w:jc w:val="both"/>
       </w:pPr>
+      <w:r>
+        <w:t>20.4. Përveç rasteve kur konteksti i kësaj Kontrate kërkon ndryshe, fjalët e përdorura në numrin njëjës do të përfshijnë edhe numrin shumës dhe anasjelltas.</w:t>
+      </w:r>
     </w:p>
     <w:p>
       <w:pPr>
@@ -2231,157 +2206,224 @@
         <w:jc w:val="both"/>
       </w:pPr>
       <w:r>
-        <w:t>20.3. Kjo kontratë është e përpiluar vetëm në gjuhën shqipe, dhe secila palë do të posedojë nga 1 (një) kopje identike të kësaj kontrate.</w:t>
-      </w:r>
-    </w:p>
-    <w:p>
-      <w:pPr>
-        <w:tabs>
-          <w:tab w:val="left" w:pos="-720"/>
-          <w:tab w:val="left" w:pos="426"/>
-        </w:tabs>
-        <w:spacing w:after="0" w:line="240" w:lineRule="auto"/>
-        <w:jc w:val="both"/>
-      </w:pPr>
-    </w:p>
-    <w:p>
-      <w:pPr>
-        <w:tabs>
-          <w:tab w:val="left" w:pos="-720"/>
-          <w:tab w:val="left" w:pos="426"/>
-        </w:tabs>
-        <w:spacing w:after="0" w:line="240" w:lineRule="auto"/>
-        <w:jc w:val="both"/>
-      </w:pPr>
-      <w:r>
-        <w:t>20.4. Përveç rasteve kur konteksti i kësaj Kontrate kërkon ndryshe, fjalët e përdorura në numrin njëjës do të përfshijnë edhe numrin shumës dhe anasjelltas.</w:t>
-      </w:r>
-    </w:p>
-    <w:p>
-      <w:pPr>
-        <w:tabs>
-          <w:tab w:val="left" w:pos="-720"/>
-          <w:tab w:val="left" w:pos="426"/>
-        </w:tabs>
-        <w:spacing w:after="0" w:line="240" w:lineRule="auto"/>
-        <w:jc w:val="both"/>
-      </w:pPr>
-    </w:p>
-    <w:p>
-      <w:pPr>
-        <w:tabs>
-          <w:tab w:val="left" w:pos="-720"/>
-          <w:tab w:val="left" w:pos="426"/>
-        </w:tabs>
-        <w:spacing w:after="0" w:line="240" w:lineRule="auto"/>
-        <w:jc w:val="both"/>
-      </w:pPr>
-      <w:r>
         <w:t>20.4. Kjo kontratë do të qeveriset nga legjislacioni pozitiv në Republikën e Kosovës.</w:t>
       </w:r>
     </w:p>
     <w:p>
       <w:pPr>
         <w:spacing w:line="240" w:lineRule="auto"/>
-        <w:jc w:val="both"/>
-        <w:rPr>
-          <w:sz w:val="12"/>
-          <w:szCs w:val="12"/>
-        </w:rPr>
-      </w:pPr>
-    </w:p>
-    <w:p>
-      <w:pPr>
-        <w:spacing w:line="240" w:lineRule="auto"/>
-        <w:jc w:val="center"/>
-        <w:rPr>
-          <w:b/>
-          <w:bCs/>
-        </w:rPr>
-      </w:pPr>
-      <w:r>
-        <w:rPr>
-          <w:b/>
-          <w:bCs/>
-        </w:rPr>
+        <w:jc w:val="center"/>
+      </w:pPr>
+    </w:p>
+    <w:p>
+      <w:r>
         <w:t>Palët nënshkruese:</w:t>
       </w:r>
     </w:p>
     <w:p>
       <w:pPr>
-        <w:spacing w:after="0" w:line="240" w:lineRule="auto"/>
-        <w:rPr>
-          <w:b/>
-          <w:bCs/>
-        </w:rPr>
-      </w:pPr>
-      <w:r>
-        <w:rPr>
-          <w:b/>
-          <w:bCs/>
-        </w:rPr>
-        <w:t xml:space="preserve">Punëdhënësi:                                                                                              Punëmarrësi:            </w:t>
-      </w:r>
-      <w:r>
-        <w:rPr>
-          <w:b/>
-          <w:bCs/>
-        </w:rPr>
-        <w:br/>
-        <w:t>EWWOLUTION L.L.C.,</w:t>
-      </w:r>
-      <w:r>
-        <w:t xml:space="preserve">         </w:t>
-      </w:r>
-      <w:r>
-        <w:rPr>
-          <w:b/>
-          <w:bCs/>
-        </w:rPr>
-        <w:t xml:space="preserve">                                                            {{employee_name}} </w:t>
-      </w:r>
-      <w:r>
-        <w:rPr>
-          <w:b/>
-          <w:bCs/>
-        </w:rPr>
-        <w:br/>
-        <w:t>Albert Salihu – Drejtor</w:t>
-      </w:r>
-    </w:p>
-    <w:p>
-      <w:pPr>
-        <w:spacing w:after="0" w:line="240" w:lineRule="auto"/>
-        <w:rPr>
-          <w:b/>
-          <w:bCs/>
-        </w:rPr>
-      </w:pPr>
-      <w:r>
-        <w:t xml:space="preserve">Nënshkrimi:________________                              </w:t>
-      </w:r>
-      <w:r>
-        <w:tab/>
-      </w:r>
-      <w:r>
-        <w:t xml:space="preserve">Nënshkrimi:_________________                                                </w:t>
-      </w:r>
-    </w:p>
-    <w:p>
-      <w:pPr>
-        <w:tabs>
-          <w:tab w:val="left" w:pos="720"/>
-          <w:tab w:val="left" w:pos="1440"/>
-          <w:tab w:val="left" w:pos="2160"/>
-          <w:tab w:val="left" w:pos="2880"/>
-          <w:tab w:val="left" w:pos="3600"/>
-          <w:tab w:val="left" w:pos="4320"/>
-          <w:tab w:val="left" w:pos="5040"/>
-          <w:tab w:val="left" w:pos="5760"/>
-          <w:tab w:val="left" w:pos="6870"/>
-        </w:tabs>
-        <w:spacing w:line="240" w:lineRule="auto"/>
-        <w:jc w:val="both"/>
+        <w:spacing w:line="240" w:lineRule="auto"/>
+      </w:pPr>
+    </w:p>
+    <w:tbl>
+      <w:tblPr>
+        <w:tblW w:w="0" w:type="auto"/>
+        <w:tblLayout w:type="fixed"/>
+        <w:tblCellMar>
+          <w:left w:w="0" w:type="dxa"/>
+          <w:right w:w="0" w:type="dxa"/>
+        </w:tblCellMar>
+        <w:tblLook w:val="04A0" w:firstRow="1" w:lastRow="0" w:firstColumn="1" w:lastColumn="0" w:noHBand="0" w:noVBand="1"/>
+      </w:tblPr>
+      <w:tblGrid>
+        <w:gridCol w:w="4703"/>
+        <w:gridCol w:w="4703"/>
+      </w:tblGrid>
+      <w:tr>
+        <w:tc>
+          <w:tcPr>
+            <w:tcW w:w="4703" w:type="dxa"/>
+          </w:tcPr>
+          <w:p>
+            <w:pPr>
+              <w:spacing w:after="0" w:line="240" w:lineRule="auto"/>
+              <w:rPr>
+                <w:b/>
+                <w:bCs/>
+              </w:rPr>
+            </w:pPr>
+            <w:r>
+              <w:rPr>
+                <w:b/>
+                <w:bCs/>
+              </w:rPr>
+              <w:t>Punëdhënësi:</w:t>
+            </w:r>
+          </w:p>
+        </w:tc>
+        <w:tc>
+          <w:tcPr>
+            <w:tcW w:w="4703" w:type="dxa"/>
+          </w:tcPr>
+          <w:p>
+            <w:pPr>
+              <w:spacing w:after="0" w:line="240" w:lineRule="auto"/>
+              <w:jc w:val="right"/>
+              <w:rPr>
+                <w:b/>
+                <w:bCs/>
+              </w:rPr>
+            </w:pPr>
+            <w:r>
+              <w:rPr>
+                <w:b/>
+                <w:bCs/>
+              </w:rPr>
+              <w:t>Punëmarrësi:</w:t>
+            </w:r>
+          </w:p>
+        </w:tc>
+      </w:tr>
+      <w:tr>
+        <w:tc>
+          <w:tcPr>
+            <w:tcW w:w="4703" w:type="dxa"/>
+          </w:tcPr>
+          <w:p>
+            <w:pPr>
+              <w:spacing w:after="0" w:line="240" w:lineRule="auto"/>
+              <w:rPr>
+                <w:b/>
+                <w:bCs/>
+              </w:rPr>
+            </w:pPr>
+            <w:r>
+              <w:rPr>
+                <w:b/>
+                <w:bCs/>
+              </w:rPr>
+              <w:t>EWWWOLUTION L.L.C.,</w:t>
+            </w:r>
+          </w:p>
+        </w:tc>
+        <w:tc>
+          <w:tcPr>
+            <w:tcW w:w="4703" w:type="dxa"/>
+          </w:tcPr>
+          <w:p>
+            <w:pPr>
+              <w:spacing w:after="0" w:line="240" w:lineRule="auto"/>
+              <w:jc w:val="right"/>
+              <w:rPr>
+                <w:b/>
+                <w:bCs/>
+              </w:rPr>
+            </w:pPr>
+            <w:r>
+              <w:rPr>
+                <w:b/>
+                <w:bCs/>
+              </w:rPr>
+              <w:t>{{employee_name}}</w:t>
+            </w:r>
+          </w:p>
+        </w:tc>
+      </w:tr>
+      <w:tr>
+        <w:tc>
+          <w:tcPr>
+            <w:tcW w:w="4703" w:type="dxa"/>
+          </w:tcPr>
+          <w:p>
+            <w:pPr>
+              <w:spacing w:after="0" w:line="240" w:lineRule="auto"/>
+              <w:rPr>
+                <w:b/>
+                <w:bCs/>
+              </w:rPr>
+            </w:pPr>
+            <w:r>
+              <w:rPr>
+                <w:b/>
+                <w:bCs/>
+              </w:rPr>
+              <w:t>Albert Salihu – Drejtor</w:t>
+            </w:r>
+          </w:p>
+        </w:tc>
+        <w:tc>
+          <w:tcPr>
+            <w:tcW w:w="4703" w:type="dxa"/>
+          </w:tcPr>
+          <w:p>
+            <w:pPr>
+              <w:spacing w:after="0" w:line="240" w:lineRule="auto"/>
+              <w:jc w:val="right"/>
+              <w:rPr>
+                <w:b/>
+                <w:bCs/>
+              </w:rPr>
+            </w:pPr>
+          </w:p>
+        </w:tc>
+      </w:tr>
+      <w:tr>
+        <w:tc>
+          <w:tcPr>
+            <w:tcW w:w="4703" w:type="dxa"/>
+          </w:tcPr>
+          <w:p>
+            <w:pPr>
+              <w:spacing w:after="0" w:line="240" w:lineRule="auto"/>
+            </w:pPr>
+          </w:p>
+        </w:tc>
+        <w:tc>
+          <w:tcPr>
+            <w:tcW w:w="4703" w:type="dxa"/>
+          </w:tcPr>
+          <w:p>
+            <w:pPr>
+              <w:spacing w:after="0" w:line="240" w:lineRule="auto"/>
+              <w:jc w:val="right"/>
+            </w:pPr>
+          </w:p>
+        </w:tc>
+      </w:tr>
+      <w:tr>
+        <w:tc>
+          <w:tcPr>
+            <w:tcW w:w="4703" w:type="dxa"/>
+          </w:tcPr>
+          <w:p>
+            <w:pPr>
+              <w:spacing w:after="0" w:line="240" w:lineRule="auto"/>
+            </w:pPr>
+            <w:r>
+              <w:t>Nënshkrimi:________________</w:t>
+            </w:r>
+          </w:p>
+        </w:tc>
+        <w:tc>
+          <w:tcPr>
+            <w:tcW w:w="4703" w:type="dxa"/>
+          </w:tcPr>
+          <w:p>
+            <w:pPr>
+              <w:spacing w:after="0" w:line="240" w:lineRule="auto"/>
+              <w:jc w:val="right"/>
+            </w:pPr>
+            <w:r>
+              <w:t>Nënshkrimi:_________________</w:t>
+            </w:r>
+          </w:p>
+        </w:tc>
+      </w:tr>
+    </w:tbl>
+    <w:p>
+      <w:pPr>
+        <w:spacing w:line="240" w:lineRule="auto"/>
+        <w:jc w:val="center"/>
       </w:pPr>
     </w:p>
     <w:p>
@@ -2612,9 +2654,9 @@
 <file path=word/numbering.xml><?xml version="1.0" encoding="utf-8"?>
 <w:numbering xmlns:wpc="http://schemas.microsoft.com/office/word/2010/wordprocessingCanvas" xmlns:cx="http://schemas.microsoft.com/office/drawing/2014/chartex" xmlns:cx1="http://schemas.microsoft.com/office/drawing/2015/9/8/chartex" xmlns:cx2="http://schemas.microsoft.com/office/drawing/2015/10/21/chartex" xmlns:cx3="http://schemas.microsoft.com/office/drawing/2016/5/9/chartex" xmlns:cx4="http://schemas.microsoft.com/office/drawing/2016/5/10/chartex" xmlns:cx5="http://schemas.microsoft.com/office/drawing/2016/5/11/chartex" xmlns:cx6="http://schemas.microsoft.com/office/drawing/2016/5/12/chartex" xmlns:cx7="http://schemas.microsoft.com/office/drawing/2016/5/13/chartex" xmlns:cx8="http://schemas.microsoft.com/office/drawing/2016/5/14/chartex" xmlns:mc="http://schemas.openxmlformats.org/markup-compatibility/2006" xmlns:aink="http://schemas.microsoft.com/office/drawing/2016/ink" xmlns:am3d="http://schemas.microsoft.com/office/drawing/2017/model3d" xmlns:o="urn:schemas-microsoft-com:office:office" xmlns:oel="http://schemas.microsoft.com/office/2019/extlst" xmlns:r="http://schemas.openxmlformats.org/officeDocument/2006/relationships" xmlns:m="http://schemas.openxmlformats.org/officeDocument/2006/math" xmlns:v="urn:schemas-microsoft-com:vml" xmlns:wp14="http://schemas.microsoft.com/office/word/2010/wordprocessingDrawing" xmlns:wp="http://schemas.openxmlformats.org/drawingml/2006/wordprocessingDrawing" xmlns:w10="urn:schemas-microsoft-com:office:word" xmlns:w="http://schemas.openxmlformats.org/wordprocessingml/2006/main" xmlns:w14="http://schemas.microsoft.com/office/word/2010/wordml" xmlns:w15="http://schemas.microsoft.com/office/word/2012/wordml" xmlns:w16cex="http://schemas.microsoft.com/office/word/2018/wordml/cex" xmlns:w16cid="http://schemas.microsoft.com/office/word/2016/wordml/cid" xmlns:w16="http://schemas.microsoft.com/office/word/2018/wordml" xmlns:w16du="http://schemas.microsoft.com/office/word/2023/wordml/word16du" xmlns:w16sdtdh="http://schemas.microsoft.com/office/word/2020/wordml/sdtdatahash" xmlns:w16sdtfl="http://schemas.microsoft.com/office/word/2024/wordml/sdtformatlock" xmlns:w16se="http://schemas.microsoft.com/office/word/2015/wordml/symex" xmlns:wpg="http://schemas.microsoft.com/office/word/2010/wordprocessingGroup" xmlns:wpi="http://schemas.microsoft.com/office/word/2010/wordprocessingInk" xmlns:wne="http://schemas.microsoft.com/office/word/2006/wordml" xmlns:wps="http://schemas.microsoft.com/office/word/2010/wordprocessingShape" mc:Ignorable="w14 w15 w16se w16cid w16 w16cex w16sdtdh w16sdtfl w16du wp14">
   <w:abstractNum w:abstractNumId="0" w15:restartNumberingAfterBreak="0">
-    <w:nsid w:val="11F62EAE"/>
+    <w:nsid w:val="2F85314B"/>
     <w:multiLevelType w:val="multilevel"/>
-    <w:tmpl w:val="28B40CFA"/>
+    <w:tmpl w:val="47A4F320"/>
     <w:lvl w:ilvl="0">
       <w:start w:val="1"/>
       <w:numFmt w:val="bullet"/>
@@ -2710,9 +2752,9 @@
     </w:lvl>
   </w:abstractNum>
   <w:abstractNum w:abstractNumId="1" w15:restartNumberingAfterBreak="0">
-    <w:nsid w:val="3C831FFC"/>
+    <w:nsid w:val="51310099"/>
     <w:multiLevelType w:val="multilevel"/>
-    <w:tmpl w:val="94CCCDBC"/>
+    <w:tmpl w:val="3D30ABDA"/>
     <w:lvl w:ilvl="0">
       <w:start w:val="1"/>
       <w:numFmt w:val="bullet"/>
@@ -2808,9 +2850,9 @@
     </w:lvl>
   </w:abstractNum>
   <w:abstractNum w:abstractNumId="2" w15:restartNumberingAfterBreak="0">
-    <w:nsid w:val="5372154A"/>
+    <w:nsid w:val="58127709"/>
     <w:multiLevelType w:val="multilevel"/>
-    <w:tmpl w:val="F9CCC522"/>
+    <w:tmpl w:val="CDFCC5D4"/>
     <w:lvl w:ilvl="0">
       <w:start w:val="1"/>
       <w:numFmt w:val="bullet"/>
@@ -2906,9 +2948,9 @@
     </w:lvl>
   </w:abstractNum>
   <w:abstractNum w:abstractNumId="3" w15:restartNumberingAfterBreak="0">
-    <w:nsid w:val="76C404F8"/>
+    <w:nsid w:val="6592671B"/>
     <w:multiLevelType w:val="multilevel"/>
-    <w:tmpl w:val="A534350C"/>
+    <w:tmpl w:val="80D880C6"/>
     <w:lvl w:ilvl="0">
       <w:start w:val="1"/>
       <w:numFmt w:val="bullet"/>
@@ -3004,9 +3046,9 @@
     </w:lvl>
   </w:abstractNum>
   <w:abstractNum w:abstractNumId="4" w15:restartNumberingAfterBreak="0">
-    <w:nsid w:val="79FC07DE"/>
+    <w:nsid w:val="692211B1"/>
     <w:multiLevelType w:val="multilevel"/>
-    <w:tmpl w:val="0AB87DBE"/>
+    <w:tmpl w:val="D90E9BB2"/>
     <w:lvl w:ilvl="0">
       <w:start w:val="1"/>
       <w:numFmt w:val="bullet"/>
@@ -3101,20 +3143,20 @@
       </w:pPr>
     </w:lvl>
   </w:abstractNum>
-  <w:num w:numId="1" w16cid:durableId="1733232906">
+  <w:num w:numId="1" w16cid:durableId="1301695176">
+    <w:abstractNumId w:val="0"/>
+  </w:num>
+  <w:num w:numId="2" w16cid:durableId="662204810">
+    <w:abstractNumId w:val="4"/>
+  </w:num>
+  <w:num w:numId="3" w16cid:durableId="403308584">
+    <w:abstractNumId w:val="3"/>
+  </w:num>
+  <w:num w:numId="4" w16cid:durableId="1104224544">
     <w:abstractNumId w:val="2"/>
   </w:num>
-  <w:num w:numId="2" w16cid:durableId="1497568564">
-    <w:abstractNumId w:val="4"/>
-  </w:num>
-  <w:num w:numId="3" w16cid:durableId="329872840">
+  <w:num w:numId="5" w16cid:durableId="1188442355">
     <w:abstractNumId w:val="1"/>
-  </w:num>
-  <w:num w:numId="4" w16cid:durableId="33120793">
-    <w:abstractNumId w:val="3"/>
-  </w:num>
-  <w:num w:numId="5" w16cid:durableId="784078760">
-    <w:abstractNumId w:val="0"/>
   </w:num>
 </w:numbering>
 </file>

</xml_diff>

<commit_message>
Add pre-download review step, NDA chaining, and clickable logo
- DocForm: split generation into Review -> Confirm & download. Review
  shows editable job duties (add/remove/regenerate, capped at 5) and a
  read-only field summary, so AI-written duties and auto-extracted
  values get a human check before anything is written to a .docx
- After a generated Employment Contract, offer to generate the
  matching NDA straight from the same values (no re-upload, no
  re-extraction) through that same review panel
- claudeApi: street_address extraction now includes the address
  descriptor (Rruga/Bulevardi/etc.) instead of assuming Rruga, since
  the shells no longer hardcode that prefix
- App: header logo is now clickable, same as the back button
- Update NDA/Contract shell templates
</commit_message>
<xml_diff>
--- a/public/contract-shell.docx
+++ b/public/contract-shell.docx
@@ -1,6 +1,6 @@
 
 <file path=word/document.xml><?xml version="1.0" encoding="utf-8"?>
-<w:document xmlns:wpc="http://schemas.microsoft.com/office/word/2010/wordprocessingCanvas" xmlns:cx="http://schemas.microsoft.com/office/drawing/2014/chartex" xmlns:cx1="http://schemas.microsoft.com/office/drawing/2015/9/8/chartex" xmlns:cx2="http://schemas.microsoft.com/office/drawing/2015/10/21/chartex" xmlns:cx3="http://schemas.microsoft.com/office/drawing/2016/5/9/chartex" xmlns:cx4="http://schemas.microsoft.com/office/drawing/2016/5/10/chartex" xmlns:cx5="http://schemas.microsoft.com/office/drawing/2016/5/11/chartex" xmlns:cx6="http://schemas.microsoft.com/office/drawing/2016/5/12/chartex" xmlns:cx7="http://schemas.microsoft.com/office/drawing/2016/5/13/chartex" xmlns:cx8="http://schemas.microsoft.com/office/drawing/2016/5/14/chartex" xmlns:mc="http://schemas.openxmlformats.org/markup-compatibility/2006" xmlns:aink="http://schemas.microsoft.com/office/drawing/2016/ink" xmlns:am3d="http://schemas.microsoft.com/office/drawing/2017/model3d" xmlns:o="urn:schemas-microsoft-com:office:office" xmlns:oel="http://schemas.microsoft.com/office/2019/extlst" xmlns:r="http://schemas.openxmlformats.org/officeDocument/2006/relationships" xmlns:m="http://schemas.openxmlformats.org/officeDocument/2006/math" xmlns:v="urn:schemas-microsoft-com:vml" xmlns:wp14="http://schemas.microsoft.com/office/word/2010/wordprocessingDrawing" xmlns:wp="http://schemas.openxmlformats.org/drawingml/2006/wordprocessingDrawing" xmlns:w10="urn:schemas-microsoft-com:office:word" xmlns:w="http://schemas.openxmlformats.org/wordprocessingml/2006/main" xmlns:w14="http://schemas.microsoft.com/office/word/2010/wordml" xmlns:w15="http://schemas.microsoft.com/office/word/2012/wordml" xmlns:w16cex="http://schemas.microsoft.com/office/word/2018/wordml/cex" xmlns:w16cid="http://schemas.microsoft.com/office/word/2016/wordml/cid" xmlns:w16="http://schemas.microsoft.com/office/word/2018/wordml" xmlns:w16du="http://schemas.microsoft.com/office/word/2023/wordml/word16du" xmlns:w16sdtdh="http://schemas.microsoft.com/office/word/2020/wordml/sdtdatahash" xmlns:w16sdtfl="http://schemas.microsoft.com/office/word/2024/wordml/sdtformatlock" xmlns:w16se="http://schemas.microsoft.com/office/word/2015/wordml/symex" xmlns:wpg="http://schemas.microsoft.com/office/word/2010/wordprocessingGroup" xmlns:wpi="http://schemas.microsoft.com/office/word/2010/wordprocessingInk" xmlns:wne="http://schemas.microsoft.com/office/word/2006/wordml" xmlns:wps="http://schemas.microsoft.com/office/word/2010/wordprocessingShape" mc:Ignorable="w14 w15 w16se w16cid w16 w16cex w16sdtdh w16sdtfl w16du wp14">
+<w:document xmlns:wpc="http://schemas.microsoft.com/office/word/2010/wordprocessingCanvas" xmlns:cx="http://schemas.microsoft.com/office/drawing/2014/chartex" xmlns:cx1="http://schemas.microsoft.com/office/drawing/2015/9/8/chartex" xmlns:cx2="http://schemas.microsoft.com/office/drawing/2015/10/21/chartex" xmlns:cx3="http://schemas.microsoft.com/office/drawing/2016/5/9/chartex" xmlns:cx4="http://schemas.microsoft.com/office/drawing/2016/5/10/chartex" xmlns:cx5="http://schemas.microsoft.com/office/drawing/2016/5/11/chartex" xmlns:cx6="http://schemas.microsoft.com/office/drawing/2016/5/12/chartex" xmlns:cx7="http://schemas.microsoft.com/office/drawing/2016/5/13/chartex" xmlns:cx8="http://schemas.microsoft.com/office/drawing/2016/5/14/chartex" xmlns:mc="http://schemas.openxmlformats.org/markup-compatibility/2006" xmlns:aink="http://schemas.microsoft.com/office/drawing/2016/ink" xmlns:am3d="http://schemas.microsoft.com/office/drawing/2017/model3d" xmlns:o="urn:schemas-microsoft-com:office:office" xmlns:oel="http://schemas.microsoft.com/office/2019/extlst" xmlns:r="http://schemas.openxmlformats.org/officeDocument/2006/relationships" xmlns:m="http://schemas.openxmlformats.org/officeDocument/2006/math" xmlns:v="urn:schemas-microsoft-com:vml" xmlns:wp14="http://schemas.microsoft.com/office/word/2010/wordprocessingDrawing" xmlns:wp="http://schemas.openxmlformats.org/drawingml/2006/wordprocessingDrawing" xmlns:w10="urn:schemas-microsoft-com:office:word" xmlns:w="http://schemas.openxmlformats.org/wordprocessingml/2006/main" xmlns:w14="http://schemas.microsoft.com/office/word/2010/wordml" xmlns:w15="http://schemas.microsoft.com/office/word/2012/wordml" xmlns:w16cei="http://schemas.microsoft.com/office/word/2026/wordml/cei" xmlns:w16cex="http://schemas.microsoft.com/office/word/2018/wordml/cex" xmlns:w16cid="http://schemas.microsoft.com/office/word/2016/wordml/cid" xmlns:w16="http://schemas.microsoft.com/office/word/2018/wordml" xmlns:w16du="http://schemas.microsoft.com/office/word/2023/wordml/word16du" xmlns:w16sdtdh="http://schemas.microsoft.com/office/word/2020/wordml/sdtdatahash" xmlns:w16sdtfl="http://schemas.microsoft.com/office/word/2024/wordml/sdtformatlock" xmlns:w16se="http://schemas.microsoft.com/office/word/2015/wordml/symex" xmlns:wpg="http://schemas.microsoft.com/office/word/2010/wordprocessingGroup" xmlns:wpi="http://schemas.microsoft.com/office/word/2010/wordprocessingInk" xmlns:wne="http://schemas.microsoft.com/office/word/2006/wordml" xmlns:wps="http://schemas.microsoft.com/office/word/2010/wordprocessingShape" mc:Ignorable="w14 w15 w16se w16cid w16 w16cex w16sdtdh w16sdtfl w16du wp14">
   <w:body>
     <w:p>
       <w:pPr>
@@ -651,7 +651,16 @@
         <w:jc w:val="both"/>
       </w:pPr>
       <w:r>
-        <w:t>8.2. Pagesa për punën e kryer, bëhet në llogarinë bankare të punëmarrësit, me numër: {{bank_account}}, në {{bank_name}} Bankën në Kosovë.</w:t>
+        <w:t xml:space="preserve">8.2. Pagesa për punën e kryer, bëhet në llogarinë bankare të punëmarrësit, me numër: {{bank_account}}, në </w:t>
+      </w:r>
+      <w:r>
+        <w:t>Bankën</w:t>
+      </w:r>
+      <w:r>
+        <w:t xml:space="preserve"> </w:t>
+      </w:r>
+      <w:r>
+        <w:t>{{bank_name}} në Kosovë.</w:t>
       </w:r>
     </w:p>
     <w:p>
@@ -2455,7 +2464,7 @@
 </file>
 
 <file path=word/endnotes.xml><?xml version="1.0" encoding="utf-8"?>
-<w:endnotes xmlns:wpc="http://schemas.microsoft.com/office/word/2010/wordprocessingCanvas" xmlns:cx="http://schemas.microsoft.com/office/drawing/2014/chartex" xmlns:cx1="http://schemas.microsoft.com/office/drawing/2015/9/8/chartex" xmlns:cx2="http://schemas.microsoft.com/office/drawing/2015/10/21/chartex" xmlns:cx3="http://schemas.microsoft.com/office/drawing/2016/5/9/chartex" xmlns:cx4="http://schemas.microsoft.com/office/drawing/2016/5/10/chartex" xmlns:cx5="http://schemas.microsoft.com/office/drawing/2016/5/11/chartex" xmlns:cx6="http://schemas.microsoft.com/office/drawing/2016/5/12/chartex" xmlns:cx7="http://schemas.microsoft.com/office/drawing/2016/5/13/chartex" xmlns:cx8="http://schemas.microsoft.com/office/drawing/2016/5/14/chartex" xmlns:mc="http://schemas.openxmlformats.org/markup-compatibility/2006" xmlns:aink="http://schemas.microsoft.com/office/drawing/2016/ink" xmlns:am3d="http://schemas.microsoft.com/office/drawing/2017/model3d" xmlns:o="urn:schemas-microsoft-com:office:office" xmlns:oel="http://schemas.microsoft.com/office/2019/extlst" xmlns:r="http://schemas.openxmlformats.org/officeDocument/2006/relationships" xmlns:m="http://schemas.openxmlformats.org/officeDocument/2006/math" xmlns:v="urn:schemas-microsoft-com:vml" xmlns:wp14="http://schemas.microsoft.com/office/word/2010/wordprocessingDrawing" xmlns:wp="http://schemas.openxmlformats.org/drawingml/2006/wordprocessingDrawing" xmlns:w10="urn:schemas-microsoft-com:office:word" xmlns:w="http://schemas.openxmlformats.org/wordprocessingml/2006/main" xmlns:w14="http://schemas.microsoft.com/office/word/2010/wordml" xmlns:w15="http://schemas.microsoft.com/office/word/2012/wordml" xmlns:w16cex="http://schemas.microsoft.com/office/word/2018/wordml/cex" xmlns:w16cid="http://schemas.microsoft.com/office/word/2016/wordml/cid" xmlns:w16="http://schemas.microsoft.com/office/word/2018/wordml" xmlns:w16du="http://schemas.microsoft.com/office/word/2023/wordml/word16du" xmlns:w16sdtdh="http://schemas.microsoft.com/office/word/2020/wordml/sdtdatahash" xmlns:w16sdtfl="http://schemas.microsoft.com/office/word/2024/wordml/sdtformatlock" xmlns:w16se="http://schemas.microsoft.com/office/word/2015/wordml/symex" xmlns:wpg="http://schemas.microsoft.com/office/word/2010/wordprocessingGroup" xmlns:wpi="http://schemas.microsoft.com/office/word/2010/wordprocessingInk" xmlns:wne="http://schemas.microsoft.com/office/word/2006/wordml" xmlns:wps="http://schemas.microsoft.com/office/word/2010/wordprocessingShape" mc:Ignorable="w14 w15 w16se w16cid w16 w16cex w16sdtdh w16sdtfl w16du wp14">
+<w:endnotes xmlns:wpc="http://schemas.microsoft.com/office/word/2010/wordprocessingCanvas" xmlns:cx="http://schemas.microsoft.com/office/drawing/2014/chartex" xmlns:cx1="http://schemas.microsoft.com/office/drawing/2015/9/8/chartex" xmlns:cx2="http://schemas.microsoft.com/office/drawing/2015/10/21/chartex" xmlns:cx3="http://schemas.microsoft.com/office/drawing/2016/5/9/chartex" xmlns:cx4="http://schemas.microsoft.com/office/drawing/2016/5/10/chartex" xmlns:cx5="http://schemas.microsoft.com/office/drawing/2016/5/11/chartex" xmlns:cx6="http://schemas.microsoft.com/office/drawing/2016/5/12/chartex" xmlns:cx7="http://schemas.microsoft.com/office/drawing/2016/5/13/chartex" xmlns:cx8="http://schemas.microsoft.com/office/drawing/2016/5/14/chartex" xmlns:mc="http://schemas.openxmlformats.org/markup-compatibility/2006" xmlns:aink="http://schemas.microsoft.com/office/drawing/2016/ink" xmlns:am3d="http://schemas.microsoft.com/office/drawing/2017/model3d" xmlns:o="urn:schemas-microsoft-com:office:office" xmlns:oel="http://schemas.microsoft.com/office/2019/extlst" xmlns:r="http://schemas.openxmlformats.org/officeDocument/2006/relationships" xmlns:m="http://schemas.openxmlformats.org/officeDocument/2006/math" xmlns:v="urn:schemas-microsoft-com:vml" xmlns:wp14="http://schemas.microsoft.com/office/word/2010/wordprocessingDrawing" xmlns:wp="http://schemas.openxmlformats.org/drawingml/2006/wordprocessingDrawing" xmlns:w10="urn:schemas-microsoft-com:office:word" xmlns:w="http://schemas.openxmlformats.org/wordprocessingml/2006/main" xmlns:w14="http://schemas.microsoft.com/office/word/2010/wordml" xmlns:w15="http://schemas.microsoft.com/office/word/2012/wordml" xmlns:w16cei="http://schemas.microsoft.com/office/word/2026/wordml/cei" xmlns:w16cex="http://schemas.microsoft.com/office/word/2018/wordml/cex" xmlns:w16cid="http://schemas.microsoft.com/office/word/2016/wordml/cid" xmlns:w16="http://schemas.microsoft.com/office/word/2018/wordml" xmlns:w16du="http://schemas.microsoft.com/office/word/2023/wordml/word16du" xmlns:w16sdtdh="http://schemas.microsoft.com/office/word/2020/wordml/sdtdatahash" xmlns:w16sdtfl="http://schemas.microsoft.com/office/word/2024/wordml/sdtformatlock" xmlns:w16se="http://schemas.microsoft.com/office/word/2015/wordml/symex" xmlns:wpg="http://schemas.microsoft.com/office/word/2010/wordprocessingGroup" xmlns:wpi="http://schemas.microsoft.com/office/word/2010/wordprocessingInk" xmlns:wne="http://schemas.microsoft.com/office/word/2006/wordml" xmlns:wps="http://schemas.microsoft.com/office/word/2010/wordprocessingShape" mc:Ignorable="w14 w15 w16se w16cid w16 w16cex w16sdtdh w16sdtfl w16du wp14">
   <w:endnote w:type="separator" w:id="-1">
     <w:p>
       <w:pPr>
@@ -2480,7 +2489,7 @@
 </file>
 
 <file path=word/footer1.xml><?xml version="1.0" encoding="utf-8"?>
-<w:ftr xmlns:wpc="http://schemas.microsoft.com/office/word/2010/wordprocessingCanvas" xmlns:cx="http://schemas.microsoft.com/office/drawing/2014/chartex" xmlns:cx1="http://schemas.microsoft.com/office/drawing/2015/9/8/chartex" xmlns:cx2="http://schemas.microsoft.com/office/drawing/2015/10/21/chartex" xmlns:cx3="http://schemas.microsoft.com/office/drawing/2016/5/9/chartex" xmlns:cx4="http://schemas.microsoft.com/office/drawing/2016/5/10/chartex" xmlns:cx5="http://schemas.microsoft.com/office/drawing/2016/5/11/chartex" xmlns:cx6="http://schemas.microsoft.com/office/drawing/2016/5/12/chartex" xmlns:cx7="http://schemas.microsoft.com/office/drawing/2016/5/13/chartex" xmlns:cx8="http://schemas.microsoft.com/office/drawing/2016/5/14/chartex" xmlns:mc="http://schemas.openxmlformats.org/markup-compatibility/2006" xmlns:aink="http://schemas.microsoft.com/office/drawing/2016/ink" xmlns:am3d="http://schemas.microsoft.com/office/drawing/2017/model3d" xmlns:o="urn:schemas-microsoft-com:office:office" xmlns:oel="http://schemas.microsoft.com/office/2019/extlst" xmlns:r="http://schemas.openxmlformats.org/officeDocument/2006/relationships" xmlns:m="http://schemas.openxmlformats.org/officeDocument/2006/math" xmlns:v="urn:schemas-microsoft-com:vml" xmlns:wp14="http://schemas.microsoft.com/office/word/2010/wordprocessingDrawing" xmlns:wp="http://schemas.openxmlformats.org/drawingml/2006/wordprocessingDrawing" xmlns:w10="urn:schemas-microsoft-com:office:word" xmlns:w="http://schemas.openxmlformats.org/wordprocessingml/2006/main" xmlns:w14="http://schemas.microsoft.com/office/word/2010/wordml" xmlns:w15="http://schemas.microsoft.com/office/word/2012/wordml" xmlns:w16cex="http://schemas.microsoft.com/office/word/2018/wordml/cex" xmlns:w16cid="http://schemas.microsoft.com/office/word/2016/wordml/cid" xmlns:w16="http://schemas.microsoft.com/office/word/2018/wordml" xmlns:w16du="http://schemas.microsoft.com/office/word/2023/wordml/word16du" xmlns:w16sdtdh="http://schemas.microsoft.com/office/word/2020/wordml/sdtdatahash" xmlns:w16sdtfl="http://schemas.microsoft.com/office/word/2024/wordml/sdtformatlock" xmlns:w16se="http://schemas.microsoft.com/office/word/2015/wordml/symex" xmlns:wpg="http://schemas.microsoft.com/office/word/2010/wordprocessingGroup" xmlns:wpi="http://schemas.microsoft.com/office/word/2010/wordprocessingInk" xmlns:wne="http://schemas.microsoft.com/office/word/2006/wordml" xmlns:wps="http://schemas.microsoft.com/office/word/2010/wordprocessingShape" mc:Ignorable="w14 w15 w16se w16cid w16 w16cex w16sdtdh w16sdtfl w16du wp14">
+<w:ftr xmlns:wpc="http://schemas.microsoft.com/office/word/2010/wordprocessingCanvas" xmlns:cx="http://schemas.microsoft.com/office/drawing/2014/chartex" xmlns:cx1="http://schemas.microsoft.com/office/drawing/2015/9/8/chartex" xmlns:cx2="http://schemas.microsoft.com/office/drawing/2015/10/21/chartex" xmlns:cx3="http://schemas.microsoft.com/office/drawing/2016/5/9/chartex" xmlns:cx4="http://schemas.microsoft.com/office/drawing/2016/5/10/chartex" xmlns:cx5="http://schemas.microsoft.com/office/drawing/2016/5/11/chartex" xmlns:cx6="http://schemas.microsoft.com/office/drawing/2016/5/12/chartex" xmlns:cx7="http://schemas.microsoft.com/office/drawing/2016/5/13/chartex" xmlns:cx8="http://schemas.microsoft.com/office/drawing/2016/5/14/chartex" xmlns:mc="http://schemas.openxmlformats.org/markup-compatibility/2006" xmlns:aink="http://schemas.microsoft.com/office/drawing/2016/ink" xmlns:am3d="http://schemas.microsoft.com/office/drawing/2017/model3d" xmlns:o="urn:schemas-microsoft-com:office:office" xmlns:oel="http://schemas.microsoft.com/office/2019/extlst" xmlns:r="http://schemas.openxmlformats.org/officeDocument/2006/relationships" xmlns:m="http://schemas.openxmlformats.org/officeDocument/2006/math" xmlns:v="urn:schemas-microsoft-com:vml" xmlns:wp14="http://schemas.microsoft.com/office/word/2010/wordprocessingDrawing" xmlns:wp="http://schemas.openxmlformats.org/drawingml/2006/wordprocessingDrawing" xmlns:w10="urn:schemas-microsoft-com:office:word" xmlns:w="http://schemas.openxmlformats.org/wordprocessingml/2006/main" xmlns:w14="http://schemas.microsoft.com/office/word/2010/wordml" xmlns:w15="http://schemas.microsoft.com/office/word/2012/wordml" xmlns:w16cei="http://schemas.microsoft.com/office/word/2026/wordml/cei" xmlns:w16cex="http://schemas.microsoft.com/office/word/2018/wordml/cex" xmlns:w16cid="http://schemas.microsoft.com/office/word/2016/wordml/cid" xmlns:w16="http://schemas.microsoft.com/office/word/2018/wordml" xmlns:w16du="http://schemas.microsoft.com/office/word/2023/wordml/word16du" xmlns:w16sdtdh="http://schemas.microsoft.com/office/word/2020/wordml/sdtdatahash" xmlns:w16sdtfl="http://schemas.microsoft.com/office/word/2024/wordml/sdtformatlock" xmlns:w16se="http://schemas.microsoft.com/office/word/2015/wordml/symex" xmlns:wpg="http://schemas.microsoft.com/office/word/2010/wordprocessingGroup" xmlns:wpi="http://schemas.microsoft.com/office/word/2010/wordprocessingInk" xmlns:wne="http://schemas.microsoft.com/office/word/2006/wordml" xmlns:wps="http://schemas.microsoft.com/office/word/2010/wordprocessingShape" mc:Ignorable="w14 w15 w16se w16cid w16 w16cex w16sdtdh w16sdtfl w16du wp14">
   <w:p>
     <w:pPr>
       <w:pBdr>
@@ -2627,7 +2636,7 @@
 </file>
 
 <file path=word/footnotes.xml><?xml version="1.0" encoding="utf-8"?>
-<w:footnotes xmlns:wpc="http://schemas.microsoft.com/office/word/2010/wordprocessingCanvas" xmlns:cx="http://schemas.microsoft.com/office/drawing/2014/chartex" xmlns:cx1="http://schemas.microsoft.com/office/drawing/2015/9/8/chartex" xmlns:cx2="http://schemas.microsoft.com/office/drawing/2015/10/21/chartex" xmlns:cx3="http://schemas.microsoft.com/office/drawing/2016/5/9/chartex" xmlns:cx4="http://schemas.microsoft.com/office/drawing/2016/5/10/chartex" xmlns:cx5="http://schemas.microsoft.com/office/drawing/2016/5/11/chartex" xmlns:cx6="http://schemas.microsoft.com/office/drawing/2016/5/12/chartex" xmlns:cx7="http://schemas.microsoft.com/office/drawing/2016/5/13/chartex" xmlns:cx8="http://schemas.microsoft.com/office/drawing/2016/5/14/chartex" xmlns:mc="http://schemas.openxmlformats.org/markup-compatibility/2006" xmlns:aink="http://schemas.microsoft.com/office/drawing/2016/ink" xmlns:am3d="http://schemas.microsoft.com/office/drawing/2017/model3d" xmlns:o="urn:schemas-microsoft-com:office:office" xmlns:oel="http://schemas.microsoft.com/office/2019/extlst" xmlns:r="http://schemas.openxmlformats.org/officeDocument/2006/relationships" xmlns:m="http://schemas.openxmlformats.org/officeDocument/2006/math" xmlns:v="urn:schemas-microsoft-com:vml" xmlns:wp14="http://schemas.microsoft.com/office/word/2010/wordprocessingDrawing" xmlns:wp="http://schemas.openxmlformats.org/drawingml/2006/wordprocessingDrawing" xmlns:w10="urn:schemas-microsoft-com:office:word" xmlns:w="http://schemas.openxmlformats.org/wordprocessingml/2006/main" xmlns:w14="http://schemas.microsoft.com/office/word/2010/wordml" xmlns:w15="http://schemas.microsoft.com/office/word/2012/wordml" xmlns:w16cex="http://schemas.microsoft.com/office/word/2018/wordml/cex" xmlns:w16cid="http://schemas.microsoft.com/office/word/2016/wordml/cid" xmlns:w16="http://schemas.microsoft.com/office/word/2018/wordml" xmlns:w16du="http://schemas.microsoft.com/office/word/2023/wordml/word16du" xmlns:w16sdtdh="http://schemas.microsoft.com/office/word/2020/wordml/sdtdatahash" xmlns:w16sdtfl="http://schemas.microsoft.com/office/word/2024/wordml/sdtformatlock" xmlns:w16se="http://schemas.microsoft.com/office/word/2015/wordml/symex" xmlns:wpg="http://schemas.microsoft.com/office/word/2010/wordprocessingGroup" xmlns:wpi="http://schemas.microsoft.com/office/word/2010/wordprocessingInk" xmlns:wne="http://schemas.microsoft.com/office/word/2006/wordml" xmlns:wps="http://schemas.microsoft.com/office/word/2010/wordprocessingShape" mc:Ignorable="w14 w15 w16se w16cid w16 w16cex w16sdtdh w16sdtfl w16du wp14">
+<w:footnotes xmlns:wpc="http://schemas.microsoft.com/office/word/2010/wordprocessingCanvas" xmlns:cx="http://schemas.microsoft.com/office/drawing/2014/chartex" xmlns:cx1="http://schemas.microsoft.com/office/drawing/2015/9/8/chartex" xmlns:cx2="http://schemas.microsoft.com/office/drawing/2015/10/21/chartex" xmlns:cx3="http://schemas.microsoft.com/office/drawing/2016/5/9/chartex" xmlns:cx4="http://schemas.microsoft.com/office/drawing/2016/5/10/chartex" xmlns:cx5="http://schemas.microsoft.com/office/drawing/2016/5/11/chartex" xmlns:cx6="http://schemas.microsoft.com/office/drawing/2016/5/12/chartex" xmlns:cx7="http://schemas.microsoft.com/office/drawing/2016/5/13/chartex" xmlns:cx8="http://schemas.microsoft.com/office/drawing/2016/5/14/chartex" xmlns:mc="http://schemas.openxmlformats.org/markup-compatibility/2006" xmlns:aink="http://schemas.microsoft.com/office/drawing/2016/ink" xmlns:am3d="http://schemas.microsoft.com/office/drawing/2017/model3d" xmlns:o="urn:schemas-microsoft-com:office:office" xmlns:oel="http://schemas.microsoft.com/office/2019/extlst" xmlns:r="http://schemas.openxmlformats.org/officeDocument/2006/relationships" xmlns:m="http://schemas.openxmlformats.org/officeDocument/2006/math" xmlns:v="urn:schemas-microsoft-com:vml" xmlns:wp14="http://schemas.microsoft.com/office/word/2010/wordprocessingDrawing" xmlns:wp="http://schemas.openxmlformats.org/drawingml/2006/wordprocessingDrawing" xmlns:w10="urn:schemas-microsoft-com:office:word" xmlns:w="http://schemas.openxmlformats.org/wordprocessingml/2006/main" xmlns:w14="http://schemas.microsoft.com/office/word/2010/wordml" xmlns:w15="http://schemas.microsoft.com/office/word/2012/wordml" xmlns:w16cei="http://schemas.microsoft.com/office/word/2026/wordml/cei" xmlns:w16cex="http://schemas.microsoft.com/office/word/2018/wordml/cex" xmlns:w16cid="http://schemas.microsoft.com/office/word/2016/wordml/cid" xmlns:w16="http://schemas.microsoft.com/office/word/2018/wordml" xmlns:w16du="http://schemas.microsoft.com/office/word/2023/wordml/word16du" xmlns:w16sdtdh="http://schemas.microsoft.com/office/word/2020/wordml/sdtdatahash" xmlns:w16sdtfl="http://schemas.microsoft.com/office/word/2024/wordml/sdtformatlock" xmlns:w16se="http://schemas.microsoft.com/office/word/2015/wordml/symex" xmlns:wpg="http://schemas.microsoft.com/office/word/2010/wordprocessingGroup" xmlns:wpi="http://schemas.microsoft.com/office/word/2010/wordprocessingInk" xmlns:wne="http://schemas.microsoft.com/office/word/2006/wordml" xmlns:wps="http://schemas.microsoft.com/office/word/2010/wordprocessingShape" mc:Ignorable="w14 w15 w16se w16cid w16 w16cex w16sdtdh w16sdtfl w16du wp14">
   <w:footnote w:type="separator" w:id="-1">
     <w:p>
       <w:pPr>
@@ -2652,7 +2661,7 @@
 </file>
 
 <file path=word/numbering.xml><?xml version="1.0" encoding="utf-8"?>
-<w:numbering xmlns:wpc="http://schemas.microsoft.com/office/word/2010/wordprocessingCanvas" xmlns:cx="http://schemas.microsoft.com/office/drawing/2014/chartex" xmlns:cx1="http://schemas.microsoft.com/office/drawing/2015/9/8/chartex" xmlns:cx2="http://schemas.microsoft.com/office/drawing/2015/10/21/chartex" xmlns:cx3="http://schemas.microsoft.com/office/drawing/2016/5/9/chartex" xmlns:cx4="http://schemas.microsoft.com/office/drawing/2016/5/10/chartex" xmlns:cx5="http://schemas.microsoft.com/office/drawing/2016/5/11/chartex" xmlns:cx6="http://schemas.microsoft.com/office/drawing/2016/5/12/chartex" xmlns:cx7="http://schemas.microsoft.com/office/drawing/2016/5/13/chartex" xmlns:cx8="http://schemas.microsoft.com/office/drawing/2016/5/14/chartex" xmlns:mc="http://schemas.openxmlformats.org/markup-compatibility/2006" xmlns:aink="http://schemas.microsoft.com/office/drawing/2016/ink" xmlns:am3d="http://schemas.microsoft.com/office/drawing/2017/model3d" xmlns:o="urn:schemas-microsoft-com:office:office" xmlns:oel="http://schemas.microsoft.com/office/2019/extlst" xmlns:r="http://schemas.openxmlformats.org/officeDocument/2006/relationships" xmlns:m="http://schemas.openxmlformats.org/officeDocument/2006/math" xmlns:v="urn:schemas-microsoft-com:vml" xmlns:wp14="http://schemas.microsoft.com/office/word/2010/wordprocessingDrawing" xmlns:wp="http://schemas.openxmlformats.org/drawingml/2006/wordprocessingDrawing" xmlns:w10="urn:schemas-microsoft-com:office:word" xmlns:w="http://schemas.openxmlformats.org/wordprocessingml/2006/main" xmlns:w14="http://schemas.microsoft.com/office/word/2010/wordml" xmlns:w15="http://schemas.microsoft.com/office/word/2012/wordml" xmlns:w16cex="http://schemas.microsoft.com/office/word/2018/wordml/cex" xmlns:w16cid="http://schemas.microsoft.com/office/word/2016/wordml/cid" xmlns:w16="http://schemas.microsoft.com/office/word/2018/wordml" xmlns:w16du="http://schemas.microsoft.com/office/word/2023/wordml/word16du" xmlns:w16sdtdh="http://schemas.microsoft.com/office/word/2020/wordml/sdtdatahash" xmlns:w16sdtfl="http://schemas.microsoft.com/office/word/2024/wordml/sdtformatlock" xmlns:w16se="http://schemas.microsoft.com/office/word/2015/wordml/symex" xmlns:wpg="http://schemas.microsoft.com/office/word/2010/wordprocessingGroup" xmlns:wpi="http://schemas.microsoft.com/office/word/2010/wordprocessingInk" xmlns:wne="http://schemas.microsoft.com/office/word/2006/wordml" xmlns:wps="http://schemas.microsoft.com/office/word/2010/wordprocessingShape" mc:Ignorable="w14 w15 w16se w16cid w16 w16cex w16sdtdh w16sdtfl w16du wp14">
+<w:numbering xmlns:wpc="http://schemas.microsoft.com/office/word/2010/wordprocessingCanvas" xmlns:cx="http://schemas.microsoft.com/office/drawing/2014/chartex" xmlns:cx1="http://schemas.microsoft.com/office/drawing/2015/9/8/chartex" xmlns:cx2="http://schemas.microsoft.com/office/drawing/2015/10/21/chartex" xmlns:cx3="http://schemas.microsoft.com/office/drawing/2016/5/9/chartex" xmlns:cx4="http://schemas.microsoft.com/office/drawing/2016/5/10/chartex" xmlns:cx5="http://schemas.microsoft.com/office/drawing/2016/5/11/chartex" xmlns:cx6="http://schemas.microsoft.com/office/drawing/2016/5/12/chartex" xmlns:cx7="http://schemas.microsoft.com/office/drawing/2016/5/13/chartex" xmlns:cx8="http://schemas.microsoft.com/office/drawing/2016/5/14/chartex" xmlns:mc="http://schemas.openxmlformats.org/markup-compatibility/2006" xmlns:aink="http://schemas.microsoft.com/office/drawing/2016/ink" xmlns:am3d="http://schemas.microsoft.com/office/drawing/2017/model3d" xmlns:o="urn:schemas-microsoft-com:office:office" xmlns:oel="http://schemas.microsoft.com/office/2019/extlst" xmlns:r="http://schemas.openxmlformats.org/officeDocument/2006/relationships" xmlns:m="http://schemas.openxmlformats.org/officeDocument/2006/math" xmlns:v="urn:schemas-microsoft-com:vml" xmlns:wp14="http://schemas.microsoft.com/office/word/2010/wordprocessingDrawing" xmlns:wp="http://schemas.openxmlformats.org/drawingml/2006/wordprocessingDrawing" xmlns:w10="urn:schemas-microsoft-com:office:word" xmlns:w="http://schemas.openxmlformats.org/wordprocessingml/2006/main" xmlns:w14="http://schemas.microsoft.com/office/word/2010/wordml" xmlns:w15="http://schemas.microsoft.com/office/word/2012/wordml" xmlns:w16cei="http://schemas.microsoft.com/office/word/2026/wordml/cei" xmlns:w16cex="http://schemas.microsoft.com/office/word/2018/wordml/cex" xmlns:w16cid="http://schemas.microsoft.com/office/word/2016/wordml/cid" xmlns:w16="http://schemas.microsoft.com/office/word/2018/wordml" xmlns:w16du="http://schemas.microsoft.com/office/word/2023/wordml/word16du" xmlns:w16sdtdh="http://schemas.microsoft.com/office/word/2020/wordml/sdtdatahash" xmlns:w16sdtfl="http://schemas.microsoft.com/office/word/2024/wordml/sdtformatlock" xmlns:w16se="http://schemas.microsoft.com/office/word/2015/wordml/symex" xmlns:wpg="http://schemas.microsoft.com/office/word/2010/wordprocessingGroup" xmlns:wpi="http://schemas.microsoft.com/office/word/2010/wordprocessingInk" xmlns:wne="http://schemas.microsoft.com/office/word/2006/wordml" xmlns:wps="http://schemas.microsoft.com/office/word/2010/wordprocessingShape" mc:Ignorable="w14 w15 w16se w16cid w16 w16cex w16sdtdh w16sdtfl w16du wp14">
   <w:abstractNum w:abstractNumId="0" w15:restartNumberingAfterBreak="0">
     <w:nsid w:val="2F85314B"/>
     <w:multiLevelType w:val="multilevel"/>

</xml_diff>